<commit_message>
Update CV site content and add publications
Update site metadata and UI text, fix conversion command, and add multiple publication PDFs and supporting materials. Changes include: set site title/description in _config.yml; update README and footer copy and last-updated dates; switch conversion command to python3 assets/convert_cv.py in docs; update download paths and filenames in index.md and cv-downloads README; add many PDFs and a review certificate under publications/; reorganize and expand publications and presentation lists in cv.md (including updated counts for publications and presentations); small CSS/HTML tweaks (hero details, rel="noopener", publication list spacing); update generated cv.pdf and cv.docx binaries; and remove two sf_match_ files. These updates reflect new publications and site content as of May 2026.
</commit_message>
<xml_diff>
--- a/cv-downloads/cv.docx
+++ b/cv-downloads/cv.docx
@@ -2,7 +2,7 @@
 <file path=word/document.xml><?xml version="1.0" encoding="utf-8"?>
 <w:document xmlns:w="http://schemas.openxmlformats.org/wordprocessingml/2006/main" xmlns:m="http://schemas.openxmlformats.org/officeDocument/2006/math" xmlns:r="http://schemas.openxmlformats.org/officeDocument/2006/relationships" xmlns:o="urn:schemas-microsoft-com:office:office" xmlns:v="urn:schemas-microsoft-com:vml" xmlns:w10="urn:schemas-microsoft-com:office:word" xmlns:a="http://schemas.openxmlformats.org/drawingml/2006/main" xmlns:pic="http://schemas.openxmlformats.org/drawingml/2006/picture" xmlns:wp="http://schemas.openxmlformats.org/drawingml/2006/wordprocessingDrawing">
   <w:body>
-    <w:bookmarkStart w:id="54" w:name="anthony-onde-morada-md"/>
+    <w:bookmarkStart w:id="67" w:name="anthony-onde-morada-md"/>
     <w:p>
       <w:pPr>
         <w:pStyle w:val="Heading1"/>
@@ -1051,7 +1051,7 @@
       </w:r>
     </w:p>
     <w:bookmarkEnd w:id="21"/>
-    <w:bookmarkStart w:id="42" w:name="publications"/>
+    <w:bookmarkStart w:id="55" w:name="publications"/>
     <w:p>
       <w:pPr>
         <w:pStyle w:val="Heading2"/>
@@ -1060,7 +1060,7 @@
         <w:t xml:space="preserve">Publications</w:t>
       </w:r>
     </w:p>
-    <w:bookmarkStart w:id="36" w:name="peer-reviewed-articles"/>
+    <w:bookmarkStart w:id="45" w:name="peer-reviewed-articles"/>
     <w:p>
       <w:pPr>
         <w:pStyle w:val="Heading3"/>
@@ -1081,10 +1081,10 @@
           <w:b/>
           <w:bCs/>
         </w:rPr>
-        <w:t xml:space="preserve">Morada, AO</w:t>
-      </w:r>
-      <w:r>
-        <w:t xml:space="preserve">, Chen CK, Akateh C, Marvin MR, Kotru A. Late Parotid Recurrence of Hepatocellular Carcinoma Following Liver Transplantation: A Case Report,</w:t>
+        <w:t xml:space="preserve">Morada AO</w:t>
+      </w:r>
+      <w:r>
+        <w:t xml:space="preserve">, Chen CK, Akateh C, Marvin MR, Kotru A. Hepatocellular Carcinoma Metastasis to Salivary Glands: A Systematic Review of Diagnostic Challenges and Survival Outcomes.</w:t>
       </w:r>
       <w:r>
         <w:t xml:space="preserve"> </w:t>
@@ -1094,10 +1094,10 @@
           <w:i/>
           <w:iCs/>
         </w:rPr>
-        <w:t xml:space="preserve">Case Reports in Hepatology</w:t>
-      </w:r>
-      <w:r>
-        <w:t xml:space="preserve">, 2025, 2965476, 5 pages, 2025. [</w:t>
+        <w:t xml:space="preserve">J Gastrointest Oncol</w:t>
+      </w:r>
+      <w:r>
+        <w:t xml:space="preserve">. 2026. doi: 10.21037/jgo-2026-1-0015. [</w:t>
       </w:r>
       <w:hyperlink r:id="rId22">
         <w:r>
@@ -1130,12 +1130,6 @@
         </w:numPr>
       </w:pPr>
       <w:r>
-        <w:t xml:space="preserve">Bashiri A,</w:t>
-      </w:r>
-      <w:r>
-        <w:t xml:space="preserve"> </w:t>
-      </w:r>
-      <w:r>
         <w:rPr>
           <w:b/>
           <w:bCs/>
@@ -1143,7 +1137,7 @@
         <w:t xml:space="preserve">Morada AO</w:t>
       </w:r>
       <w:r>
-        <w:t xml:space="preserve">, Sultany M, et al. Trends of Trauma Admissions in a Rural Trauma Center During Coronavirus Disease 2019 Pandemic.</w:t>
+        <w:t xml:space="preserve">, Kropp Lopez A, Droney A, Lopez R. Traumatic Page kidney: a systematic review and patient report of bilateral Gerota’s fascia release.</w:t>
       </w:r>
       <w:r>
         <w:t xml:space="preserve"> </w:t>
@@ -1153,10 +1147,10 @@
           <w:i/>
           <w:iCs/>
         </w:rPr>
-        <w:t xml:space="preserve">J Surg Res</w:t>
-      </w:r>
-      <w:r>
-        <w:t xml:space="preserve">. 2023;289:202-210. PMID: 37141703. [</w:t>
+        <w:t xml:space="preserve">Trauma Surgery &amp; Acute Care Open</w:t>
+      </w:r>
+      <w:r>
+        <w:t xml:space="preserve">. 2026;11:e002041. [</w:t>
       </w:r>
       <w:hyperlink r:id="rId24">
         <w:r>
@@ -1174,7 +1168,7 @@
           <w:rPr>
             <w:rStyle w:val="Hyperlink"/>
           </w:rPr>
-          <w:t xml:space="preserve">PubMed</w:t>
+          <w:t xml:space="preserve">PDF</w:t>
         </w:r>
       </w:hyperlink>
       <w:r>
@@ -1189,20 +1183,14 @@
         </w:numPr>
       </w:pPr>
       <w:r>
-        <w:t xml:space="preserve">Keller HR, Senapathi SH,</w:t>
-      </w:r>
-      <w:r>
-        <w:t xml:space="preserve"> </w:t>
-      </w:r>
-      <w:r>
-        <w:rPr>
-          <w:b/>
-          <w:bCs/>
-        </w:rPr>
-        <w:t xml:space="preserve">Morada AO</w:t>
-      </w:r>
-      <w:r>
-        <w:t xml:space="preserve">, et al. Survival in patients with neuroendocrine tumors of the colon, rectum and small intestine.</w:t>
+        <w:rPr>
+          <w:b/>
+          <w:bCs/>
+        </w:rPr>
+        <w:t xml:space="preserve">Morada, AO</w:t>
+      </w:r>
+      <w:r>
+        <w:t xml:space="preserve">, Chen CK, Akateh C, Marvin MR, Kotru A. Late Parotid Recurrence of Hepatocellular Carcinoma Following Liver Transplantation: A Case Report,</w:t>
       </w:r>
       <w:r>
         <w:t xml:space="preserve"> </w:t>
@@ -1212,10 +1200,10 @@
           <w:i/>
           <w:iCs/>
         </w:rPr>
-        <w:t xml:space="preserve">Am J Surg</w:t>
-      </w:r>
-      <w:r>
-        <w:t xml:space="preserve">. 2023;225(1):58-65. PMID: 36216612. [</w:t>
+        <w:t xml:space="preserve">Case Reports in Hepatology</w:t>
+      </w:r>
+      <w:r>
+        <w:t xml:space="preserve">, 2025, 2965476, 5 pages, 2025. [</w:t>
       </w:r>
       <w:hyperlink r:id="rId26">
         <w:r>
@@ -1233,7 +1221,7 @@
           <w:rPr>
             <w:rStyle w:val="Hyperlink"/>
           </w:rPr>
-          <w:t xml:space="preserve">PubMed</w:t>
+          <w:t xml:space="preserve">PDF</w:t>
         </w:r>
       </w:hyperlink>
       <w:r>
@@ -1248,6 +1236,12 @@
         </w:numPr>
       </w:pPr>
       <w:r>
+        <w:t xml:space="preserve">Bashiri A,</w:t>
+      </w:r>
+      <w:r>
+        <w:t xml:space="preserve"> </w:t>
+      </w:r>
+      <w:r>
         <w:rPr>
           <w:b/>
           <w:bCs/>
@@ -1255,7 +1249,7 @@
         <w:t xml:space="preserve">Morada AO</w:t>
       </w:r>
       <w:r>
-        <w:t xml:space="preserve">, Senapathi SH, Bashiri A, Chai S, Cagir B. A systematic review of primary ileostomy site malignancies.</w:t>
+        <w:t xml:space="preserve">, Sultany M, Senapathi S, Silverman S, Casós S, Behm R. Trends of Trauma Admissions in a Rural Trauma Center During Coronavirus Disease 2019 Pandemic.</w:t>
       </w:r>
       <w:r>
         <w:t xml:space="preserve"> </w:t>
@@ -1265,10 +1259,10 @@
           <w:i/>
           <w:iCs/>
         </w:rPr>
-        <w:t xml:space="preserve">Surg Endosc</w:t>
-      </w:r>
-      <w:r>
-        <w:t xml:space="preserve">. 2022;36(3):1750-1760. PMID: 34997348. [</w:t>
+        <w:t xml:space="preserve">J Surg Res</w:t>
+      </w:r>
+      <w:r>
+        <w:t xml:space="preserve">. 2023;289:202-210. PMID: 37141703. [</w:t>
       </w:r>
       <w:hyperlink r:id="rId28">
         <w:r>
@@ -1286,6 +1280,17 @@
           <w:rPr>
             <w:rStyle w:val="Hyperlink"/>
           </w:rPr>
+          <w:t xml:space="preserve">PubMed</w:t>
+        </w:r>
+      </w:hyperlink>
+      <w:r>
+        <w:t xml:space="preserve">] [</w:t>
+      </w:r>
+      <w:hyperlink r:id="rId30">
+        <w:r>
+          <w:rPr>
+            <w:rStyle w:val="Hyperlink"/>
+          </w:rPr>
           <w:t xml:space="preserve">PDF</w:t>
         </w:r>
       </w:hyperlink>
@@ -1301,7 +1306,7 @@
         </w:numPr>
       </w:pPr>
       <w:r>
-        <w:t xml:space="preserve">Sundaram N,</w:t>
+        <w:t xml:space="preserve">Keller HR, Senapathi SH,</w:t>
       </w:r>
       <w:r>
         <w:t xml:space="preserve"> </w:t>
@@ -1314,7 +1319,7 @@
         <w:t xml:space="preserve">Morada AO</w:t>
       </w:r>
       <w:r>
-        <w:t xml:space="preserve">, Bashiri A, Cagir B. CT images demonstrating the natural progression of locally advanced partially treated rectal cancer.</w:t>
+        <w:t xml:space="preserve">, Bertsch D, Cagir B. Survival in patients with neuroendocrine tumors of the colon, rectum and small intestine.</w:t>
       </w:r>
       <w:r>
         <w:t xml:space="preserve"> </w:t>
@@ -1324,12 +1329,12 @@
           <w:i/>
           <w:iCs/>
         </w:rPr>
-        <w:t xml:space="preserve">BMJ Case Rep</w:t>
-      </w:r>
-      <w:r>
-        <w:t xml:space="preserve">. 2022;15(3):e247609. PMID: 35332009. [</w:t>
-      </w:r>
-      <w:hyperlink r:id="rId30">
+        <w:t xml:space="preserve">Am J Surg</w:t>
+      </w:r>
+      <w:r>
+        <w:t xml:space="preserve">. 2023;225(1):58-65. PMID: 36216612. [</w:t>
+      </w:r>
+      <w:hyperlink r:id="rId31">
         <w:r>
           <w:rPr>
             <w:rStyle w:val="Hyperlink"/>
@@ -1340,102 +1345,23 @@
       <w:r>
         <w:t xml:space="preserve">] [</w:t>
       </w:r>
-      <w:hyperlink r:id="rId31">
-        <w:r>
-          <w:rPr>
-            <w:rStyle w:val="Hyperlink"/>
-          </w:rPr>
-          <w:t xml:space="preserve">PMC Free</w:t>
-        </w:r>
-      </w:hyperlink>
-      <w:r>
-        <w:t xml:space="preserve">]</w:t>
-      </w:r>
-    </w:p>
-    <w:p>
-      <w:pPr>
-        <w:numPr>
-          <w:ilvl w:val="0"/>
-          <w:numId w:val="1015"/>
-        </w:numPr>
-      </w:pPr>
-      <w:r>
-        <w:t xml:space="preserve">Senapathi H,</w:t>
-      </w:r>
-      <w:r>
-        <w:t xml:space="preserve"> </w:t>
-      </w:r>
-      <w:r>
-        <w:rPr>
-          <w:b/>
-          <w:bCs/>
-        </w:rPr>
-        <w:t xml:space="preserve">Morada AO</w:t>
-      </w:r>
-      <w:r>
-        <w:t xml:space="preserve">, Perry M, et al. Prognostic Factors in Gastrointestinal Leiomyosarcomas: An Analysis Using the SEER Database.</w:t>
-      </w:r>
-      <w:r>
-        <w:t xml:space="preserve"> </w:t>
-      </w:r>
-      <w:r>
-        <w:rPr>
-          <w:i/>
-          <w:iCs/>
-        </w:rPr>
-        <w:t xml:space="preserve">Cureus</w:t>
-      </w:r>
-      <w:r>
-        <w:t xml:space="preserve">. 2021;13(11):e19447. PMID: 34926025. [</w:t>
-      </w:r>
       <w:hyperlink r:id="rId32">
         <w:r>
           <w:rPr>
             <w:rStyle w:val="Hyperlink"/>
           </w:rPr>
-          <w:t xml:space="preserve">Open Access</w:t>
+          <w:t xml:space="preserve">PubMed</w:t>
         </w:r>
       </w:hyperlink>
       <w:r>
-        <w:t xml:space="preserve">]</w:t>
-      </w:r>
-    </w:p>
-    <w:p>
-      <w:pPr>
-        <w:numPr>
-          <w:ilvl w:val="0"/>
-          <w:numId w:val="1015"/>
-        </w:numPr>
-      </w:pPr>
-      <w:r>
-        <w:rPr>
-          <w:b/>
-          <w:bCs/>
-        </w:rPr>
-        <w:t xml:space="preserve">Morada AO</w:t>
-      </w:r>
-      <w:r>
-        <w:t xml:space="preserve">, Scheidel C, Brown JL, et al. Predicting severe COVID-19 outcomes for triage and resource allocation.</w:t>
-      </w:r>
-      <w:r>
-        <w:t xml:space="preserve"> </w:t>
-      </w:r>
-      <w:r>
-        <w:rPr>
-          <w:i/>
-          <w:iCs/>
-        </w:rPr>
-        <w:t xml:space="preserve">MedRxiv</w:t>
-      </w:r>
-      <w:r>
-        <w:t xml:space="preserve">. 2021. [</w:t>
+        <w:t xml:space="preserve">] [</w:t>
       </w:r>
       <w:hyperlink r:id="rId33">
         <w:r>
           <w:rPr>
             <w:rStyle w:val="Hyperlink"/>
           </w:rPr>
-          <w:t xml:space="preserve">Preprint</w:t>
+          <w:t xml:space="preserve">PDF</w:t>
         </w:r>
       </w:hyperlink>
       <w:r>
@@ -1450,7 +1376,20 @@
         </w:numPr>
       </w:pPr>
       <w:r>
-        <w:t xml:space="preserve">Guo H, Garcia-Vedrenne AE, Isserlin R, et al. Phosphoproteomic network analysis in the sea urchin</w:t>
+        <w:t xml:space="preserve">Yeung E, Bertram C, Senapathi H, Perry M,</w:t>
+      </w:r>
+      <w:r>
+        <w:t xml:space="preserve"> </w:t>
+      </w:r>
+      <w:r>
+        <w:rPr>
+          <w:b/>
+          <w:bCs/>
+        </w:rPr>
+        <w:t xml:space="preserve">Morada AO</w:t>
+      </w:r>
+      <w:r>
+        <w:t xml:space="preserve">, Bertsch D, Cagir B. Evaluation of the survival outcomes of intestinal adenosquamous carcinomas using the SEER 18 registry: What do we know?</w:t>
       </w:r>
       <w:r>
         <w:t xml:space="preserve"> </w:t>
@@ -1460,13 +1399,28 @@
           <w:i/>
           <w:iCs/>
         </w:rPr>
-        <w:t xml:space="preserve">Strongylocentrotus purpuratus</w:t>
-      </w:r>
-      <w:r>
-        <w:t xml:space="preserve"> </w:t>
-      </w:r>
-      <w:r>
-        <w:t xml:space="preserve">reveals new candidates in egg activation.</w:t>
+        <w:t xml:space="preserve">The Guthrie Journal</w:t>
+      </w:r>
+      <w:r>
+        <w:t xml:space="preserve">. 2023;75(1):7-16.</w:t>
+      </w:r>
+    </w:p>
+    <w:p>
+      <w:pPr>
+        <w:numPr>
+          <w:ilvl w:val="0"/>
+          <w:numId w:val="1015"/>
+        </w:numPr>
+      </w:pPr>
+      <w:r>
+        <w:rPr>
+          <w:b/>
+          <w:bCs/>
+        </w:rPr>
+        <w:t xml:space="preserve">Morada AO</w:t>
+      </w:r>
+      <w:r>
+        <w:t xml:space="preserve">, Senapathi SH, Bashiri A, Chai S, Cagir B. A systematic review of primary ileostomy site malignancies.</w:t>
       </w:r>
       <w:r>
         <w:t xml:space="preserve"> </w:t>
@@ -1476,10 +1430,10 @@
           <w:i/>
           <w:iCs/>
         </w:rPr>
-        <w:t xml:space="preserve">Proteomics</w:t>
-      </w:r>
-      <w:r>
-        <w:t xml:space="preserve">. 2015;15(23-24):4080-4095. PMID: 26572944. [</w:t>
+        <w:t xml:space="preserve">Surg Endosc</w:t>
+      </w:r>
+      <w:r>
+        <w:t xml:space="preserve">. 2022;36(3):1750-1760. PMID: 34997348. [</w:t>
       </w:r>
       <w:hyperlink r:id="rId34">
         <w:r>
@@ -1497,30 +1451,26 @@
           <w:rPr>
             <w:rStyle w:val="Hyperlink"/>
           </w:rPr>
-          <w:t xml:space="preserve">PubMed</w:t>
+          <w:t xml:space="preserve">PDF</w:t>
         </w:r>
       </w:hyperlink>
       <w:r>
         <w:t xml:space="preserve">]</w:t>
       </w:r>
     </w:p>
-    <w:bookmarkEnd w:id="36"/>
-    <w:bookmarkStart w:id="38" w:name="manuscripts-under-reviewin-preparation"/>
-    <w:p>
-      <w:pPr>
-        <w:pStyle w:val="Heading3"/>
-      </w:pPr>
-      <w:r>
-        <w:t xml:space="preserve">Manuscripts Under Review/In Preparation</w:t>
-      </w:r>
-    </w:p>
-    <w:p>
-      <w:pPr>
-        <w:numPr>
-          <w:ilvl w:val="0"/>
-          <w:numId w:val="1016"/>
-        </w:numPr>
-      </w:pPr>
+    <w:p>
+      <w:pPr>
+        <w:numPr>
+          <w:ilvl w:val="0"/>
+          <w:numId w:val="1015"/>
+        </w:numPr>
+      </w:pPr>
+      <w:r>
+        <w:t xml:space="preserve">Sundaram N,</w:t>
+      </w:r>
+      <w:r>
+        <w:t xml:space="preserve"> </w:t>
+      </w:r>
       <w:r>
         <w:rPr>
           <w:b/>
@@ -1529,7 +1479,7 @@
         <w:t xml:space="preserve">Morada AO</w:t>
       </w:r>
       <w:r>
-        <w:t xml:space="preserve">, Kropp Lopez A, Droney AC, Matera D, Lopez R. Traumatic Page Kidney: A Systematic Review and Case Report of Bilateral Gerota’s Fascia Release.</w:t>
+        <w:t xml:space="preserve">, Bashiri A, Cagir B. CT images demonstrating the natural progression of locally advanced partially treated rectal cancer.</w:t>
       </w:r>
       <w:r>
         <w:t xml:space="preserve"> </w:t>
@@ -1539,76 +1489,67 @@
           <w:i/>
           <w:iCs/>
         </w:rPr>
-        <w:t xml:space="preserve">Submitted to Trauma Surgery &amp; Acute Care Open</w:t>
-      </w:r>
-      <w:r>
-        <w:t xml:space="preserve">; in review.</w:t>
-      </w:r>
-    </w:p>
-    <w:p>
-      <w:pPr>
-        <w:numPr>
-          <w:ilvl w:val="0"/>
-          <w:numId w:val="1016"/>
-        </w:numPr>
-      </w:pPr>
-      <w:r>
-        <w:rPr>
-          <w:b/>
-          <w:bCs/>
-        </w:rPr>
-        <w:t xml:space="preserve">Morada AO</w:t>
-      </w:r>
-      <w:r>
-        <w:t xml:space="preserve">, Chen CK, Akateh C, Marvin MR, Kotru A. Hepatocellular Carcinoma Metastasis to Salivary Glands: A Systematic Review of Diagnostic Challenges and Survival Outcomes.</w:t>
-      </w:r>
-      <w:r>
-        <w:t xml:space="preserve"> </w:t>
-      </w:r>
-      <w:r>
-        <w:rPr>
-          <w:i/>
-          <w:iCs/>
-        </w:rPr>
-        <w:t xml:space="preserve">Submitted to Journal of Gastrointestinal Oncology</w:t>
-      </w:r>
-      <w:r>
-        <w:t xml:space="preserve">; in review.</w:t>
-      </w:r>
-    </w:p>
-    <w:p>
-      <w:pPr>
-        <w:numPr>
-          <w:ilvl w:val="0"/>
-          <w:numId w:val="1016"/>
-        </w:numPr>
-      </w:pPr>
-      <w:r>
-        <w:t xml:space="preserve">Dewar Z,</w:t>
-      </w:r>
-      <w:r>
-        <w:t xml:space="preserve"> </w:t>
-      </w:r>
-      <w:r>
-        <w:rPr>
-          <w:b/>
-          <w:bCs/>
-        </w:rPr>
-        <w:t xml:space="preserve">Morada AO</w:t>
-      </w:r>
-      <w:r>
-        <w:t xml:space="preserve">, Senapathi H, Rittenberger J. Ultrasound versus combined ultrasound and modified Seldinger technique in obtaining difficult peripheral intravenous access: A systematic review and meta-analysis. [</w:t>
+        <w:t xml:space="preserve">BMJ Case Rep</w:t>
+      </w:r>
+      <w:r>
+        <w:t xml:space="preserve">. 2022;15(3):e247609. PMID: 35332009. [</w:t>
+      </w:r>
+      <w:hyperlink r:id="rId36">
+        <w:r>
+          <w:rPr>
+            <w:rStyle w:val="Hyperlink"/>
+          </w:rPr>
+          <w:t xml:space="preserve">Full Text</w:t>
+        </w:r>
+      </w:hyperlink>
+      <w:r>
+        <w:t xml:space="preserve">] [</w:t>
       </w:r>
       <w:hyperlink r:id="rId37">
         <w:r>
           <w:rPr>
             <w:rStyle w:val="Hyperlink"/>
           </w:rPr>
-          <w:t xml:space="preserve">PROSPERO Protocol</w:t>
+          <w:t xml:space="preserve">PMC Free</w:t>
         </w:r>
       </w:hyperlink>
       <w:r>
+        <w:t xml:space="preserve">] [</w:t>
+      </w:r>
+      <w:hyperlink r:id="rId38">
+        <w:r>
+          <w:rPr>
+            <w:rStyle w:val="Hyperlink"/>
+          </w:rPr>
+          <w:t xml:space="preserve">PDF</w:t>
+        </w:r>
+      </w:hyperlink>
+      <w:r>
         <w:t xml:space="preserve">]</w:t>
+      </w:r>
+    </w:p>
+    <w:p>
+      <w:pPr>
+        <w:numPr>
+          <w:ilvl w:val="0"/>
+          <w:numId w:val="1015"/>
+        </w:numPr>
+      </w:pPr>
+      <w:r>
+        <w:t xml:space="preserve">Senapathi H,</w:t>
+      </w:r>
+      <w:r>
+        <w:t xml:space="preserve"> </w:t>
+      </w:r>
+      <w:r>
+        <w:rPr>
+          <w:b/>
+          <w:bCs/>
+        </w:rPr>
+        <w:t xml:space="preserve">Morada AO</w:t>
+      </w:r>
+      <w:r>
+        <w:t xml:space="preserve">, Perry M, Bertram C, Yeung E, Sultany M, Bertsch D, Cagir B. Prognostic Factors in Gastrointestinal Leiomyosarcomas: An Analysis Using the SEER Database.</w:t>
       </w:r>
       <w:r>
         <w:t xml:space="preserve"> </w:t>
@@ -1618,22 +1559,41 @@
           <w:i/>
           <w:iCs/>
         </w:rPr>
-        <w:t xml:space="preserve">Manuscript in preparation</w:t>
-      </w:r>
-    </w:p>
-    <w:p>
-      <w:pPr>
-        <w:numPr>
-          <w:ilvl w:val="0"/>
-          <w:numId w:val="1016"/>
-        </w:numPr>
-      </w:pPr>
-      <w:r>
-        <w:t xml:space="preserve">Seungwoo C, Senapathi SH,</w:t>
-      </w:r>
-      <w:r>
-        <w:t xml:space="preserve"> </w:t>
-      </w:r>
+        <w:t xml:space="preserve">Cureus</w:t>
+      </w:r>
+      <w:r>
+        <w:t xml:space="preserve">. 2021;13(11):e19447. PMID: 34926025. [</w:t>
+      </w:r>
+      <w:hyperlink r:id="rId39">
+        <w:r>
+          <w:rPr>
+            <w:rStyle w:val="Hyperlink"/>
+          </w:rPr>
+          <w:t xml:space="preserve">Full Text</w:t>
+        </w:r>
+      </w:hyperlink>
+      <w:r>
+        <w:t xml:space="preserve">] [</w:t>
+      </w:r>
+      <w:hyperlink r:id="rId40">
+        <w:r>
+          <w:rPr>
+            <w:rStyle w:val="Hyperlink"/>
+          </w:rPr>
+          <w:t xml:space="preserve">PDF</w:t>
+        </w:r>
+      </w:hyperlink>
+      <w:r>
+        <w:t xml:space="preserve">]</w:t>
+      </w:r>
+    </w:p>
+    <w:p>
+      <w:pPr>
+        <w:numPr>
+          <w:ilvl w:val="0"/>
+          <w:numId w:val="1015"/>
+        </w:numPr>
+      </w:pPr>
       <w:r>
         <w:rPr>
           <w:b/>
@@ -1642,7 +1602,7 @@
         <w:t xml:space="preserve">Morada AO</w:t>
       </w:r>
       <w:r>
-        <w:t xml:space="preserve">, et al. Exploring the quality of internal medicine resident ambulatory patient care: a feasibility study.</w:t>
+        <w:t xml:space="preserve">, Scheidel C, Brown JL, Albright J, Kolade V, Cagir B. Predicting severe COVID-19 outcomes for triage and resource allocation.</w:t>
       </w:r>
       <w:r>
         <w:t xml:space="preserve"> </w:t>
@@ -1652,36 +1612,56 @@
           <w:i/>
           <w:iCs/>
         </w:rPr>
-        <w:t xml:space="preserve">Manuscript in preparation</w:t>
-      </w:r>
-    </w:p>
-    <w:bookmarkEnd w:id="38"/>
-    <w:bookmarkStart w:id="40" w:name="media-publications"/>
-    <w:p>
-      <w:pPr>
-        <w:pStyle w:val="Heading3"/>
-      </w:pPr>
-      <w:r>
-        <w:t xml:space="preserve">Media &amp; Publications</w:t>
-      </w:r>
-    </w:p>
-    <w:p>
-      <w:pPr>
-        <w:pStyle w:val="Compact"/>
-        <w:numPr>
-          <w:ilvl w:val="0"/>
-          <w:numId w:val="1017"/>
-        </w:numPr>
-      </w:pPr>
-      <w:r>
-        <w:rPr>
-          <w:b/>
-          <w:bCs/>
-        </w:rPr>
-        <w:t xml:space="preserve">Morada AO</w:t>
-      </w:r>
-      <w:r>
-        <w:t xml:space="preserve">, Mackarey P. Finding your way clear of opioid problems.</w:t>
+        <w:t xml:space="preserve">MedRxiv</w:t>
+      </w:r>
+      <w:r>
+        <w:t xml:space="preserve">. 2021. [</w:t>
+      </w:r>
+      <w:hyperlink r:id="rId41">
+        <w:r>
+          <w:rPr>
+            <w:rStyle w:val="Hyperlink"/>
+          </w:rPr>
+          <w:t xml:space="preserve">Preprint</w:t>
+        </w:r>
+      </w:hyperlink>
+      <w:r>
+        <w:t xml:space="preserve">] [</w:t>
+      </w:r>
+      <w:hyperlink r:id="rId42">
+        <w:r>
+          <w:rPr>
+            <w:rStyle w:val="Hyperlink"/>
+          </w:rPr>
+          <w:t xml:space="preserve">PDF</w:t>
+        </w:r>
+      </w:hyperlink>
+      <w:r>
+        <w:t xml:space="preserve">]</w:t>
+      </w:r>
+    </w:p>
+    <w:p>
+      <w:pPr>
+        <w:numPr>
+          <w:ilvl w:val="0"/>
+          <w:numId w:val="1015"/>
+        </w:numPr>
+      </w:pPr>
+      <w:r>
+        <w:t xml:space="preserve">Guo H, Garcia-Vedrenne AE, Isserlin R, Lugowski A,</w:t>
+      </w:r>
+      <w:r>
+        <w:t xml:space="preserve"> </w:t>
+      </w:r>
+      <w:r>
+        <w:rPr>
+          <w:b/>
+          <w:bCs/>
+        </w:rPr>
+        <w:t xml:space="preserve">Morada A</w:t>
+      </w:r>
+      <w:r>
+        <w:t xml:space="preserve">, Sun A, Miao Y, Kuzmanov U, Wan C, Ma H, Foltz K, Emili A. Phosphoproteomic network analysis in the sea urchin</w:t>
       </w:r>
       <w:r>
         <w:t xml:space="preserve"> </w:t>
@@ -1691,12 +1671,427 @@
           <w:i/>
           <w:iCs/>
         </w:rPr>
+        <w:t xml:space="preserve">Strongylocentrotus purpuratus</w:t>
+      </w:r>
+      <w:r>
+        <w:t xml:space="preserve"> </w:t>
+      </w:r>
+      <w:r>
+        <w:t xml:space="preserve">reveals new candidates in egg activation.</w:t>
+      </w:r>
+      <w:r>
+        <w:t xml:space="preserve"> </w:t>
+      </w:r>
+      <w:r>
+        <w:rPr>
+          <w:i/>
+          <w:iCs/>
+        </w:rPr>
+        <w:t xml:space="preserve">Proteomics</w:t>
+      </w:r>
+      <w:r>
+        <w:t xml:space="preserve">. 2015;15(23-24):4080-4095. PMID: 26227301. [</w:t>
+      </w:r>
+      <w:hyperlink r:id="rId43">
+        <w:r>
+          <w:rPr>
+            <w:rStyle w:val="Hyperlink"/>
+          </w:rPr>
+          <w:t xml:space="preserve">Full Text</w:t>
+        </w:r>
+      </w:hyperlink>
+      <w:r>
+        <w:t xml:space="preserve">] [</w:t>
+      </w:r>
+      <w:hyperlink r:id="rId44">
+        <w:r>
+          <w:rPr>
+            <w:rStyle w:val="Hyperlink"/>
+          </w:rPr>
+          <w:t xml:space="preserve">PubMed</w:t>
+        </w:r>
+      </w:hyperlink>
+      <w:r>
+        <w:t xml:space="preserve">]</w:t>
+      </w:r>
+    </w:p>
+    <w:bookmarkEnd w:id="45"/>
+    <w:bookmarkStart w:id="49" w:name="published-abstracts"/>
+    <w:p>
+      <w:pPr>
+        <w:pStyle w:val="Heading3"/>
+      </w:pPr>
+      <w:r>
+        <w:t xml:space="preserve">Published Abstracts</w:t>
+      </w:r>
+    </w:p>
+    <w:p>
+      <w:pPr>
+        <w:numPr>
+          <w:ilvl w:val="0"/>
+          <w:numId w:val="1016"/>
+        </w:numPr>
+      </w:pPr>
+      <w:r>
+        <w:t xml:space="preserve">Marica S, Dearborn M, Wilson MJ, Satchell E, Bashiri A, Senapathi S,</w:t>
+      </w:r>
+      <w:r>
+        <w:t xml:space="preserve"> </w:t>
+      </w:r>
+      <w:r>
+        <w:rPr>
+          <w:b/>
+          <w:bCs/>
+        </w:rPr>
+        <w:t xml:space="preserve">Morada AO</w:t>
+      </w:r>
+      <w:r>
+        <w:t xml:space="preserve">, Hussain A, Sampson L. Comparison of Bovine Carotid Artery Grafts versus ePTFE Grafts for Dialysis Access in a Rural Population.</w:t>
+      </w:r>
+      <w:r>
+        <w:t xml:space="preserve"> </w:t>
+      </w:r>
+      <w:r>
+        <w:rPr>
+          <w:i/>
+          <w:iCs/>
+        </w:rPr>
+        <w:t xml:space="preserve">J Vasc Surg</w:t>
+      </w:r>
+      <w:r>
+        <w:t xml:space="preserve">. 2025;81(6):e17-e18. doi: 10.1016/j.jvs.2025.03.075. [</w:t>
+      </w:r>
+      <w:hyperlink r:id="rId46">
+        <w:r>
+          <w:rPr>
+            <w:rStyle w:val="Hyperlink"/>
+          </w:rPr>
+          <w:t xml:space="preserve">PDF</w:t>
+        </w:r>
+      </w:hyperlink>
+      <w:r>
+        <w:t xml:space="preserve">]</w:t>
+      </w:r>
+    </w:p>
+    <w:p>
+      <w:pPr>
+        <w:numPr>
+          <w:ilvl w:val="0"/>
+          <w:numId w:val="1016"/>
+        </w:numPr>
+      </w:pPr>
+      <w:r>
+        <w:t xml:space="preserve">Guru S, Scharf M,</w:t>
+      </w:r>
+      <w:r>
+        <w:t xml:space="preserve"> </w:t>
+      </w:r>
+      <w:r>
+        <w:rPr>
+          <w:b/>
+          <w:bCs/>
+        </w:rPr>
+        <w:t xml:space="preserve">Morada AO</w:t>
+      </w:r>
+      <w:r>
+        <w:t xml:space="preserve">, Sundaram N, Senapathi S, Dombert L, Bashiri A, Cagir B. Systematic review of malignant transformation of perianal fistulae.</w:t>
+      </w:r>
+      <w:r>
+        <w:t xml:space="preserve"> </w:t>
+      </w:r>
+      <w:r>
+        <w:rPr>
+          <w:i/>
+          <w:iCs/>
+        </w:rPr>
+        <w:t xml:space="preserve">Dis Colon Rectum</w:t>
+      </w:r>
+      <w:r>
+        <w:t xml:space="preserve">. 2022;65(5):163.</w:t>
+      </w:r>
+    </w:p>
+    <w:p>
+      <w:pPr>
+        <w:numPr>
+          <w:ilvl w:val="0"/>
+          <w:numId w:val="1016"/>
+        </w:numPr>
+      </w:pPr>
+      <w:r>
+        <w:t xml:space="preserve">Senapathi H, Perry M,</w:t>
+      </w:r>
+      <w:r>
+        <w:t xml:space="preserve"> </w:t>
+      </w:r>
+      <w:r>
+        <w:rPr>
+          <w:b/>
+          <w:bCs/>
+        </w:rPr>
+        <w:t xml:space="preserve">Morada AO</w:t>
+      </w:r>
+      <w:r>
+        <w:t xml:space="preserve">, Bertram C, Yeung E, Bertsch D, Cagir B. Review of Intestinal Leiomyosarcomas: Epidemiology and Survival.</w:t>
+      </w:r>
+      <w:r>
+        <w:t xml:space="preserve"> </w:t>
+      </w:r>
+      <w:r>
+        <w:rPr>
+          <w:i/>
+          <w:iCs/>
+        </w:rPr>
+        <w:t xml:space="preserve">Ann Surg Oncol</w:t>
+      </w:r>
+      <w:r>
+        <w:t xml:space="preserve">. 2021;28(Suppl 1):S77-S78.</w:t>
+      </w:r>
+    </w:p>
+    <w:p>
+      <w:pPr>
+        <w:numPr>
+          <w:ilvl w:val="0"/>
+          <w:numId w:val="1016"/>
+        </w:numPr>
+      </w:pPr>
+      <w:r>
+        <w:t xml:space="preserve">Yeung E, Senapathi H, Perry M, Bertram C,</w:t>
+      </w:r>
+      <w:r>
+        <w:t xml:space="preserve"> </w:t>
+      </w:r>
+      <w:r>
+        <w:rPr>
+          <w:b/>
+          <w:bCs/>
+        </w:rPr>
+        <w:t xml:space="preserve">Morada AO</w:t>
+      </w:r>
+      <w:r>
+        <w:t xml:space="preserve">, Bertsch D, Cagir B. Evaluation of the Survival Outcomes of Intestinal Adenosquamous Carcinomas with SEER-18 Registry: What Do We Know?</w:t>
+      </w:r>
+      <w:r>
+        <w:t xml:space="preserve"> </w:t>
+      </w:r>
+      <w:r>
+        <w:rPr>
+          <w:i/>
+          <w:iCs/>
+        </w:rPr>
+        <w:t xml:space="preserve">Ann Surg Oncol</w:t>
+      </w:r>
+      <w:r>
+        <w:t xml:space="preserve">. 2021;28(Suppl 1):S79.</w:t>
+      </w:r>
+    </w:p>
+    <w:p>
+      <w:pPr>
+        <w:numPr>
+          <w:ilvl w:val="0"/>
+          <w:numId w:val="1016"/>
+        </w:numPr>
+      </w:pPr>
+      <w:r>
+        <w:t xml:space="preserve">Miller BN, Mehta P,</w:t>
+      </w:r>
+      <w:r>
+        <w:t xml:space="preserve"> </w:t>
+      </w:r>
+      <w:r>
+        <w:rPr>
+          <w:b/>
+          <w:bCs/>
+        </w:rPr>
+        <w:t xml:space="preserve">Morada AO</w:t>
+      </w:r>
+      <w:r>
+        <w:t xml:space="preserve">, Hendifar A, Annamalai A, Wachsman A, Dhall D, Nissen N. Age-Related Differences in Presentation and Management of Pancreatic Neuroendocrine Tumors.</w:t>
+      </w:r>
+      <w:r>
+        <w:t xml:space="preserve"> </w:t>
+      </w:r>
+      <w:r>
+        <w:rPr>
+          <w:i/>
+          <w:iCs/>
+        </w:rPr>
+        <w:t xml:space="preserve">Ann Surg Oncol</w:t>
+      </w:r>
+      <w:r>
+        <w:t xml:space="preserve">. 2017;24(Suppl):S127-S128.</w:t>
+      </w:r>
+    </w:p>
+    <w:p>
+      <w:pPr>
+        <w:numPr>
+          <w:ilvl w:val="0"/>
+          <w:numId w:val="1016"/>
+        </w:numPr>
+      </w:pPr>
+      <w:r>
+        <w:rPr>
+          <w:b/>
+          <w:bCs/>
+        </w:rPr>
+        <w:t xml:space="preserve">Morada AO</w:t>
+      </w:r>
+      <w:r>
+        <w:t xml:space="preserve">, Mehta P, Miller BN, Annamalai AA, Wachsman A, Gaddam S, Jamil LH, Lo SK, Nissen NN. Pancreatic fistula or leak after distal pancreatectomy: has anything changed? 13-year single surgeon experience.</w:t>
+      </w:r>
+      <w:r>
+        <w:t xml:space="preserve"> </w:t>
+      </w:r>
+      <w:r>
+        <w:rPr>
+          <w:i/>
+          <w:iCs/>
+        </w:rPr>
+        <w:t xml:space="preserve">Gastroenterology</w:t>
+      </w:r>
+      <w:r>
+        <w:t xml:space="preserve">. 2017;152(5 Suppl 1):S1272-S1273. doi: 10.1016/S0016-5085(17)34242-7. [</w:t>
+      </w:r>
+      <w:hyperlink r:id="rId47">
+        <w:r>
+          <w:rPr>
+            <w:rStyle w:val="Hyperlink"/>
+          </w:rPr>
+          <w:t xml:space="preserve">PDF</w:t>
+        </w:r>
+      </w:hyperlink>
+      <w:r>
+        <w:t xml:space="preserve">]</w:t>
+      </w:r>
+    </w:p>
+    <w:p>
+      <w:pPr>
+        <w:numPr>
+          <w:ilvl w:val="0"/>
+          <w:numId w:val="1016"/>
+        </w:numPr>
+      </w:pPr>
+      <w:r>
+        <w:t xml:space="preserve">Miller BN, Garnett G,</w:t>
+      </w:r>
+      <w:r>
+        <w:t xml:space="preserve"> </w:t>
+      </w:r>
+      <w:r>
+        <w:rPr>
+          <w:b/>
+          <w:bCs/>
+        </w:rPr>
+        <w:t xml:space="preserve">Morada AO</w:t>
+      </w:r>
+      <w:r>
+        <w:t xml:space="preserve">, Annamalai AA, Hendifar A, Dhall D, Lo SK, Wachsman A, Nissen NN. Parenchymal-Preserving Resection for Pancreatic Neuroendocrine Tumors: are the Outcomes Justified?</w:t>
+      </w:r>
+      <w:r>
+        <w:t xml:space="preserve"> </w:t>
+      </w:r>
+      <w:r>
+        <w:rPr>
+          <w:i/>
+          <w:iCs/>
+        </w:rPr>
+        <w:t xml:space="preserve">Gastroenterology</w:t>
+      </w:r>
+      <w:r>
+        <w:t xml:space="preserve">. 2017;152(5 Suppl 1):S1274. doi: 10.1016/S0016-5085(17)34247-6. [</w:t>
+      </w:r>
+      <w:hyperlink r:id="rId48">
+        <w:r>
+          <w:rPr>
+            <w:rStyle w:val="Hyperlink"/>
+          </w:rPr>
+          <w:t xml:space="preserve">PDF</w:t>
+        </w:r>
+      </w:hyperlink>
+      <w:r>
+        <w:t xml:space="preserve">]</w:t>
+      </w:r>
+    </w:p>
+    <w:bookmarkEnd w:id="49"/>
+    <w:bookmarkStart w:id="50" w:name="manuscripts-under-reviewin-preparation"/>
+    <w:p>
+      <w:pPr>
+        <w:pStyle w:val="Heading3"/>
+      </w:pPr>
+      <w:r>
+        <w:t xml:space="preserve">Manuscripts Under Review/In Preparation</w:t>
+      </w:r>
+    </w:p>
+    <w:p>
+      <w:pPr>
+        <w:pStyle w:val="Compact"/>
+        <w:numPr>
+          <w:ilvl w:val="0"/>
+          <w:numId w:val="1017"/>
+        </w:numPr>
+      </w:pPr>
+      <w:r>
+        <w:rPr>
+          <w:b/>
+          <w:bCs/>
+        </w:rPr>
+        <w:t xml:space="preserve">Morada AO</w:t>
+      </w:r>
+      <w:r>
+        <w:t xml:space="preserve">, Becker JL, Furey MJ, Summa CH, Richards KR, Bodde J, Jordan RM, Bannon JP, Falvo A. Building a Better Sub-Internship Evaluation: A Multi-Stakeholder Approach.</w:t>
+      </w:r>
+      <w:r>
+        <w:t xml:space="preserve"> </w:t>
+      </w:r>
+      <w:r>
+        <w:rPr>
+          <w:i/>
+          <w:iCs/>
+        </w:rPr>
+        <w:t xml:space="preserve">Manuscript in preparation for submission to Global Surgical Education: Journal of the Association for Surgical Education.</w:t>
+      </w:r>
+    </w:p>
+    <w:bookmarkEnd w:id="50"/>
+    <w:bookmarkStart w:id="52" w:name="media-publications"/>
+    <w:p>
+      <w:pPr>
+        <w:pStyle w:val="Heading3"/>
+      </w:pPr>
+      <w:r>
+        <w:t xml:space="preserve">Media &amp; Publications</w:t>
+      </w:r>
+    </w:p>
+    <w:p>
+      <w:pPr>
+        <w:pStyle w:val="Compact"/>
+        <w:numPr>
+          <w:ilvl w:val="0"/>
+          <w:numId w:val="1018"/>
+        </w:numPr>
+      </w:pPr>
+      <w:r>
+        <w:rPr>
+          <w:b/>
+          <w:bCs/>
+        </w:rPr>
+        <w:t xml:space="preserve">Morada AO</w:t>
+      </w:r>
+      <w:r>
+        <w:t xml:space="preserve">, Mackarey P. Finding your way clear of opioid problems.</w:t>
+      </w:r>
+      <w:r>
+        <w:t xml:space="preserve"> </w:t>
+      </w:r>
+      <w:r>
+        <w:rPr>
+          <w:i/>
+          <w:iCs/>
+        </w:rPr>
         <w:t xml:space="preserve">The Scranton Times-Tribune</w:t>
       </w:r>
       <w:r>
         <w:t xml:space="preserve">. August 27, 2018. [</w:t>
       </w:r>
-      <w:hyperlink r:id="rId39">
+      <w:hyperlink r:id="rId51">
         <w:r>
           <w:rPr>
             <w:rStyle w:val="Hyperlink"/>
@@ -1713,7 +2108,7 @@
         <w:pStyle w:val="Compact"/>
         <w:numPr>
           <w:ilvl w:val="0"/>
-          <w:numId w:val="1017"/>
+          <w:numId w:val="1018"/>
         </w:numPr>
       </w:pPr>
       <w:r>
@@ -1740,8 +2135,8 @@
         <w:t xml:space="preserve">. December 2017.</w:t>
       </w:r>
     </w:p>
-    <w:bookmarkEnd w:id="40"/>
-    <w:bookmarkStart w:id="41" w:name="peer-review-activities"/>
+    <w:bookmarkEnd w:id="52"/>
+    <w:bookmarkStart w:id="54" w:name="peer-review-activities"/>
     <w:p>
       <w:pPr>
         <w:pStyle w:val="Heading3"/>
@@ -1755,7 +2150,40 @@
         <w:pStyle w:val="Compact"/>
         <w:numPr>
           <w:ilvl w:val="0"/>
-          <w:numId w:val="1018"/>
+          <w:numId w:val="1019"/>
+        </w:numPr>
+      </w:pPr>
+      <w:r>
+        <w:rPr>
+          <w:b/>
+          <w:bCs/>
+        </w:rPr>
+        <w:t xml:space="preserve">HepatoBiliary Surgery and Nutrition</w:t>
+      </w:r>
+      <w:r>
+        <w:t xml:space="preserve"> </w:t>
+      </w:r>
+      <w:r>
+        <w:t xml:space="preserve">(2026) - Manuscript #HBSN-2026-0250 [</w:t>
+      </w:r>
+      <w:hyperlink r:id="rId53">
+        <w:r>
+          <w:rPr>
+            <w:rStyle w:val="Hyperlink"/>
+          </w:rPr>
+          <w:t xml:space="preserve">Certificate</w:t>
+        </w:r>
+      </w:hyperlink>
+      <w:r>
+        <w:t xml:space="preserve">]</w:t>
+      </w:r>
+    </w:p>
+    <w:p>
+      <w:pPr>
+        <w:pStyle w:val="Compact"/>
+        <w:numPr>
+          <w:ilvl w:val="0"/>
+          <w:numId w:val="1019"/>
         </w:numPr>
       </w:pPr>
       <w:r>
@@ -1777,7 +2205,7 @@
         <w:pStyle w:val="Compact"/>
         <w:numPr>
           <w:ilvl w:val="0"/>
-          <w:numId w:val="1018"/>
+          <w:numId w:val="1019"/>
         </w:numPr>
       </w:pPr>
       <w:r>
@@ -1799,7 +2227,7 @@
         <w:pStyle w:val="Compact"/>
         <w:numPr>
           <w:ilvl w:val="0"/>
-          <w:numId w:val="1018"/>
+          <w:numId w:val="1019"/>
         </w:numPr>
       </w:pPr>
       <w:r>
@@ -1821,7 +2249,7 @@
         <w:pStyle w:val="Compact"/>
         <w:numPr>
           <w:ilvl w:val="0"/>
-          <w:numId w:val="1018"/>
+          <w:numId w:val="1019"/>
         </w:numPr>
       </w:pPr>
       <w:r>
@@ -1843,7 +2271,7 @@
         <w:pStyle w:val="Compact"/>
         <w:numPr>
           <w:ilvl w:val="0"/>
-          <w:numId w:val="1018"/>
+          <w:numId w:val="1019"/>
         </w:numPr>
       </w:pPr>
       <w:r>
@@ -1865,7 +2293,7 @@
         <w:pStyle w:val="Compact"/>
         <w:numPr>
           <w:ilvl w:val="0"/>
-          <w:numId w:val="1018"/>
+          <w:numId w:val="1019"/>
         </w:numPr>
       </w:pPr>
       <w:r>
@@ -1887,7 +2315,7 @@
         <w:pStyle w:val="Compact"/>
         <w:numPr>
           <w:ilvl w:val="0"/>
-          <w:numId w:val="1018"/>
+          <w:numId w:val="1019"/>
         </w:numPr>
       </w:pPr>
       <w:r>
@@ -1904,9 +2332,9 @@
         <w:t xml:space="preserve">(2021) - Manuscript #M21-2536</w:t>
       </w:r>
     </w:p>
-    <w:bookmarkEnd w:id="41"/>
-    <w:bookmarkEnd w:id="42"/>
-    <w:bookmarkStart w:id="47" w:name="presentations"/>
+    <w:bookmarkEnd w:id="54"/>
+    <w:bookmarkEnd w:id="55"/>
+    <w:bookmarkStart w:id="60" w:name="presentations"/>
     <w:p>
       <w:pPr>
         <w:pStyle w:val="Heading2"/>
@@ -1915,7 +2343,7 @@
         <w:t xml:space="preserve">Presentations</w:t>
       </w:r>
     </w:p>
-    <w:bookmarkStart w:id="43" w:name="oral-presentations"/>
+    <w:bookmarkStart w:id="56" w:name="oral-presentations"/>
     <w:p>
       <w:pPr>
         <w:pStyle w:val="Heading3"/>
@@ -1933,15 +2361,14 @@
           <w:i/>
           <w:iCs/>
         </w:rPr>
-        <w:t xml:space="preserve">Accepted</w:t>
-      </w:r>
-    </w:p>
-    <w:p>
-      <w:pPr>
-        <w:pStyle w:val="Compact"/>
-        <w:numPr>
-          <w:ilvl w:val="0"/>
-          <w:numId w:val="1019"/>
+        <w:t xml:space="preserve">Completed</w:t>
+      </w:r>
+    </w:p>
+    <w:p>
+      <w:pPr>
+        <w:numPr>
+          <w:ilvl w:val="0"/>
+          <w:numId w:val="1020"/>
         </w:numPr>
       </w:pPr>
       <w:r>
@@ -1962,25 +2389,47 @@
           <w:i/>
           <w:iCs/>
         </w:rPr>
-        <w:t xml:space="preserve">Accepted for 2026 Association for Surgical Education Annual Meeting,</w:t>
-      </w:r>
-      <w:r>
-        <w:t xml:space="preserve"> </w:t>
-      </w:r>
-      <w:r>
-        <w:t xml:space="preserve">Atlanta, GA. April 29 2026.</w:t>
-      </w:r>
-    </w:p>
-    <w:p>
-      <w:pPr>
-        <w:pStyle w:val="FirstParagraph"/>
-      </w:pPr>
+        <w:t xml:space="preserve">2026 Association for Surgical Education Annual Meeting</w:t>
+      </w:r>
+      <w:r>
+        <w:t xml:space="preserve">, Atlanta, GA. April 29, 2026.</w:t>
+      </w:r>
+    </w:p>
+    <w:p>
+      <w:pPr>
+        <w:numPr>
+          <w:ilvl w:val="0"/>
+          <w:numId w:val="1020"/>
+        </w:numPr>
+      </w:pPr>
+      <w:r>
+        <w:t xml:space="preserve">Bashiri A,</w:t>
+      </w:r>
+      <w:r>
+        <w:t xml:space="preserve"> </w:t>
+      </w:r>
+      <w:r>
+        <w:rPr>
+          <w:b/>
+          <w:bCs/>
+        </w:rPr>
+        <w:t xml:space="preserve">Morada AO</w:t>
+      </w:r>
+      <w:r>
+        <w:t xml:space="preserve">, Silverman S, Behara M, Behm R. Trends of Trauma Admissions in a Rural Trauma Center During Coronavirus Disease 2019 Pandemic.</w:t>
+      </w:r>
+      <w:r>
+        <w:t xml:space="preserve"> </w:t>
+      </w:r>
       <w:r>
         <w:rPr>
           <w:i/>
           <w:iCs/>
         </w:rPr>
-        <w:t xml:space="preserve">Completed</w:t>
+        <w:t xml:space="preserve">Stanley Conklin Research Day</w:t>
+      </w:r>
+      <w:r>
+        <w:t xml:space="preserve">, Sayre, PA. April 2021.</w:t>
       </w:r>
     </w:p>
     <w:p>
@@ -1991,7 +2440,7 @@
         </w:numPr>
       </w:pPr>
       <w:r>
-        <w:t xml:space="preserve">Bashiri A,</w:t>
+        <w:t xml:space="preserve">Bertram C, Yeung E, Senapathi H, Perry M,</w:t>
       </w:r>
       <w:r>
         <w:t xml:space="preserve"> </w:t>
@@ -2004,7 +2453,7 @@
         <w:t xml:space="preserve">Morada AO</w:t>
       </w:r>
       <w:r>
-        <w:t xml:space="preserve">, Silverman S, Behara M, Behm R. Trends of Trauma Admissions in a Rural Trauma Center During Coronavirus Disease 2019 Pandemic.</w:t>
+        <w:t xml:space="preserve">, Bertsch D, Cagir B. Evaluation of the Survival outcomes of Intestinal Adenosquamous Carcinomas with SEER-18 registry: What do we know?</w:t>
       </w:r>
       <w:r>
         <w:t xml:space="preserve"> </w:t>
@@ -2028,7 +2477,7 @@
         </w:numPr>
       </w:pPr>
       <w:r>
-        <w:t xml:space="preserve">Bertram C, Yeung E, Senapathi H, Perry M,</w:t>
+        <w:t xml:space="preserve">Chai S, Kolade V, Senapathi SH,</w:t>
       </w:r>
       <w:r>
         <w:t xml:space="preserve"> </w:t>
@@ -2041,7 +2490,7 @@
         <w:t xml:space="preserve">Morada AO</w:t>
       </w:r>
       <w:r>
-        <w:t xml:space="preserve">, Bertsch D, Cagir B. Evaluation of the Survival outcomes of Intestinal Adenosquamous Carcinomas with SEER-18 registry: What do we know?</w:t>
+        <w:t xml:space="preserve">, Khaliq AA, Malviya B. Exploring the quality of internal medicine resident ambulatory patient care: a feasibility study of the patient-doctor relationship.</w:t>
       </w:r>
       <w:r>
         <w:t xml:space="preserve"> </w:t>
@@ -2065,7 +2514,7 @@
         </w:numPr>
       </w:pPr>
       <w:r>
-        <w:t xml:space="preserve">Chai S, Kolade V, Senapathi SH,</w:t>
+        <w:t xml:space="preserve">Senapathi SH,</w:t>
       </w:r>
       <w:r>
         <w:t xml:space="preserve"> </w:t>
@@ -2078,7 +2527,7 @@
         <w:t xml:space="preserve">Morada AO</w:t>
       </w:r>
       <w:r>
-        <w:t xml:space="preserve">, Khaliq AA, Malviya B. Exploring the quality of internal medicine resident ambulatory patient care: a feasibility study of the patient-doctor relationship.</w:t>
+        <w:t xml:space="preserve">, Morgan P, Cagir B. Comparing Epidemiology and Survival of Gastro-Intestinal Stromal Tumors and Leiomyosarcomas.</w:t>
       </w:r>
       <w:r>
         <w:t xml:space="preserve"> </w:t>
@@ -2102,12 +2551,6 @@
         </w:numPr>
       </w:pPr>
       <w:r>
-        <w:t xml:space="preserve">Senapathi SH,</w:t>
-      </w:r>
-      <w:r>
-        <w:t xml:space="preserve"> </w:t>
-      </w:r>
-      <w:r>
         <w:rPr>
           <w:b/>
           <w:bCs/>
@@ -2115,7 +2558,7 @@
         <w:t xml:space="preserve">Morada AO</w:t>
       </w:r>
       <w:r>
-        <w:t xml:space="preserve">, Morgan P, Cagir B. Comparing Epidemiology and Survival of Gastro-Intestinal Stromal Tumors and Leiomyosarcomas.</w:t>
+        <w:t xml:space="preserve">, Marinock J, Mirshahi U, Smelser DT, Carey DJ. Examining the Genetic Burden of Two Rare Autosomal Dominant Diseases.</w:t>
       </w:r>
       <w:r>
         <w:t xml:space="preserve"> </w:t>
@@ -2125,10 +2568,10 @@
           <w:i/>
           <w:iCs/>
         </w:rPr>
-        <w:t xml:space="preserve">Stanley Conklin Research Day</w:t>
-      </w:r>
-      <w:r>
-        <w:t xml:space="preserve">, Sayre, PA. April 2021.</w:t>
+        <w:t xml:space="preserve">2018 Geisinger Commonwealth School of Medicine Summer Research Symposium</w:t>
+      </w:r>
+      <w:r>
+        <w:t xml:space="preserve">, Scranton, PA, August 2018.</w:t>
       </w:r>
     </w:p>
     <w:p>
@@ -2146,7 +2589,7 @@
         <w:t xml:space="preserve">Morada AO</w:t>
       </w:r>
       <w:r>
-        <w:t xml:space="preserve">, Marinock J, Mirshahi U, Smelser DT, Carey DJ. Examining the Genetic Burden of Two Rare Autosomal Dominant Diseases.</w:t>
+        <w:t xml:space="preserve">, Mehta PA, Miller BN, Alagappan AA, Wachsman A, Gaddam S, Jamil L, Lo S, Nissen N. Management of Pancreatic Fistula or Leak after Pancreatectomy: Perspective from a 14-year Single Surgeon Experience.</w:t>
       </w:r>
       <w:r>
         <w:t xml:space="preserve"> </w:t>
@@ -2156,10 +2599,10 @@
           <w:i/>
           <w:iCs/>
         </w:rPr>
-        <w:t xml:space="preserve">2018 Geisinger Commonwealth School of Medicine Summer Research Symposium</w:t>
-      </w:r>
-      <w:r>
-        <w:t xml:space="preserve">, Scranton, PA, August 2018.</w:t>
+        <w:t xml:space="preserve">Southern California Chapter of the American College of Surgeons Annual Scientific Meeting</w:t>
+      </w:r>
+      <w:r>
+        <w:t xml:space="preserve">, Santa Barbara, CA, January 2017.</w:t>
       </w:r>
     </w:p>
     <w:p>
@@ -2170,6 +2613,12 @@
         </w:numPr>
       </w:pPr>
       <w:r>
+        <w:t xml:space="preserve">Miller BN,</w:t>
+      </w:r>
+      <w:r>
+        <w:t xml:space="preserve"> </w:t>
+      </w:r>
+      <w:r>
         <w:rPr>
           <w:b/>
           <w:bCs/>
@@ -2177,7 +2626,7 @@
         <w:t xml:space="preserve">Morada AO</w:t>
       </w:r>
       <w:r>
-        <w:t xml:space="preserve">, Mehta PA, Miller BN, Alagappan AA, Wachsman A, Gaddam S, Jamil L, Lo S, Nissen N. Management of Pancreatic Fistula or Leak after Pancreatectomy: Perspective from a 14-year Single Surgeon Experience.</w:t>
+        <w:t xml:space="preserve">, Gangi A, Annamalai AA, Wachsman A, Hendifar A, Tuli R, Nissen N. Challenging the Treatment Paradigm of Oligometastatic Pancreatic Adenocarcinoma with Selective Use of Locoregional Cytoreductive Therapies.</w:t>
       </w:r>
       <w:r>
         <w:t xml:space="preserve"> </w:t>
@@ -2201,7 +2650,7 @@
         </w:numPr>
       </w:pPr>
       <w:r>
-        <w:t xml:space="preserve">Miller BN,</w:t>
+        <w:t xml:space="preserve">Miller BN, Mehta PA,</w:t>
       </w:r>
       <w:r>
         <w:t xml:space="preserve"> </w:t>
@@ -2214,7 +2663,7 @@
         <w:t xml:space="preserve">Morada AO</w:t>
       </w:r>
       <w:r>
-        <w:t xml:space="preserve">, Gangi A, Annamalai AA, Wachsman A, Hendifar A, Tuli R, Nissen N. Challenging the Treatment Paradigm of Oligometastatic Pancreatic Adenocarcinoma with Selective Use of Locoregional Cytoreductive Therapies.</w:t>
+        <w:t xml:space="preserve">, Hendifar A, Annamalai AA, Wachsman A, Deepti D, Nissen N. Age-Related Differences in Presentation and Management of Pancreatic Neuroendocrine Tumors.</w:t>
       </w:r>
       <w:r>
         <w:t xml:space="preserve"> </w:t>
@@ -2224,25 +2673,29 @@
           <w:i/>
           <w:iCs/>
         </w:rPr>
-        <w:t xml:space="preserve">Southern California Chapter of the American College of Surgeons Annual Scientific Meeting</w:t>
-      </w:r>
-      <w:r>
-        <w:t xml:space="preserve">, Santa Barbara, CA, January 2017.</w:t>
-      </w:r>
-    </w:p>
-    <w:p>
-      <w:pPr>
-        <w:numPr>
-          <w:ilvl w:val="0"/>
-          <w:numId w:val="1020"/>
-        </w:numPr>
-      </w:pPr>
-      <w:r>
-        <w:t xml:space="preserve">Miller BN, Mehta PA,</w:t>
-      </w:r>
-      <w:r>
-        <w:t xml:space="preserve"> </w:t>
-      </w:r>
+        <w:t xml:space="preserve">Society of Surgical Oncology’s 70th Annual Cancer Symposium</w:t>
+      </w:r>
+      <w:r>
+        <w:t xml:space="preserve">, Seattle, WA, March 2017.</w:t>
+      </w:r>
+    </w:p>
+    <w:bookmarkEnd w:id="56"/>
+    <w:bookmarkStart w:id="59" w:name="poster-presentations"/>
+    <w:p>
+      <w:pPr>
+        <w:pStyle w:val="Heading3"/>
+      </w:pPr>
+      <w:r>
+        <w:t xml:space="preserve">Poster Presentations</w:t>
+      </w:r>
+    </w:p>
+    <w:p>
+      <w:pPr>
+        <w:numPr>
+          <w:ilvl w:val="0"/>
+          <w:numId w:val="1021"/>
+        </w:numPr>
+      </w:pPr>
       <w:r>
         <w:rPr>
           <w:b/>
@@ -2251,7 +2704,7 @@
         <w:t xml:space="preserve">Morada AO</w:t>
       </w:r>
       <w:r>
-        <w:t xml:space="preserve">, Hendifar A, Annamalai AA, Wachsman A, Deepti D, Nissen N. Age-Related Differences in Presentation and Management of Pancreatic Neuroendocrine Tumors.</w:t>
+        <w:t xml:space="preserve">, Chen CK, Akateh C, Marvin MR, Kotru A. Uncommon Sites of Hepatocellular Carcinoma Metastasis: A Systematic Review of Salivary Gland Involvement.</w:t>
       </w:r>
       <w:r>
         <w:t xml:space="preserve"> </w:t>
@@ -2261,47 +2714,6 @@
           <w:i/>
           <w:iCs/>
         </w:rPr>
-        <w:t xml:space="preserve">Society of Surgical Oncology’s 70th Annual Cancer Symposium</w:t>
-      </w:r>
-      <w:r>
-        <w:t xml:space="preserve">, Seattle, WA, March 2017.</w:t>
-      </w:r>
-    </w:p>
-    <w:bookmarkEnd w:id="43"/>
-    <w:bookmarkStart w:id="46" w:name="poster-presentations"/>
-    <w:p>
-      <w:pPr>
-        <w:pStyle w:val="Heading3"/>
-      </w:pPr>
-      <w:r>
-        <w:t xml:space="preserve">Poster Presentations</w:t>
-      </w:r>
-    </w:p>
-    <w:p>
-      <w:pPr>
-        <w:numPr>
-          <w:ilvl w:val="0"/>
-          <w:numId w:val="1021"/>
-        </w:numPr>
-      </w:pPr>
-      <w:r>
-        <w:rPr>
-          <w:b/>
-          <w:bCs/>
-        </w:rPr>
-        <w:t xml:space="preserve">Morada AO</w:t>
-      </w:r>
-      <w:r>
-        <w:t xml:space="preserve">, Chen CK, Akateh C, Marvin MR, Kotru A. Uncommon Sites of Hepatocellular Carcinoma Metastasis: A Systematic Review of Salivary Gland Involvement.</w:t>
-      </w:r>
-      <w:r>
-        <w:t xml:space="preserve"> </w:t>
-      </w:r>
-      <w:r>
-        <w:rPr>
-          <w:i/>
-          <w:iCs/>
-        </w:rPr>
         <w:t xml:space="preserve">International Liver Transplantation Society (ILTS) Annual Congress 2025</w:t>
       </w:r>
       <w:r>
@@ -2310,7 +2722,7 @@
       <w:r>
         <w:t xml:space="preserve"> </w:t>
       </w:r>
-      <w:hyperlink r:id="rId44">
+      <w:hyperlink r:id="rId57">
         <w:r>
           <w:rPr>
             <w:rStyle w:val="Hyperlink"/>
@@ -2352,7 +2764,7 @@
       <w:r>
         <w:t xml:space="preserve"> </w:t>
       </w:r>
-      <w:hyperlink r:id="rId45">
+      <w:hyperlink r:id="rId58">
         <w:r>
           <w:rPr>
             <w:rStyle w:val="Hyperlink"/>
@@ -3059,9 +3471,9 @@
         <w:t xml:space="preserve">, Santa Barbara, CA, May 2013.</w:t>
       </w:r>
     </w:p>
-    <w:bookmarkEnd w:id="46"/>
-    <w:bookmarkEnd w:id="47"/>
-    <w:bookmarkStart w:id="48" w:name="honors-and-awards"/>
+    <w:bookmarkEnd w:id="59"/>
+    <w:bookmarkEnd w:id="60"/>
+    <w:bookmarkStart w:id="61" w:name="honors-and-awards"/>
     <w:p>
       <w:pPr>
         <w:pStyle w:val="Heading2"/>
@@ -3215,8 +3627,8 @@
         <w:t xml:space="preserve">, UC Santa Barbara (2013, 2014)</w:t>
       </w:r>
     </w:p>
-    <w:bookmarkEnd w:id="48"/>
-    <w:bookmarkStart w:id="49" w:name="leadership-and-service"/>
+    <w:bookmarkEnd w:id="61"/>
+    <w:bookmarkStart w:id="62" w:name="leadership-and-service"/>
     <w:p>
       <w:pPr>
         <w:pStyle w:val="Heading2"/>
@@ -3551,8 +3963,8 @@
         <w:t xml:space="preserve">Rotational volunteer experience across multiple clinical departments including emergency medicine and surgery</w:t>
       </w:r>
     </w:p>
-    <w:bookmarkEnd w:id="49"/>
-    <w:bookmarkStart w:id="50" w:name="technical-skills-and-certifications"/>
+    <w:bookmarkEnd w:id="62"/>
+    <w:bookmarkStart w:id="63" w:name="technical-skills-and-certifications"/>
     <w:p>
       <w:pPr>
         <w:pStyle w:val="Heading2"/>
@@ -3769,8 +4181,8 @@
         <w:t xml:space="preserve">Emergency Medical Technician - California EMSA License E084811 (2011-2017)</w:t>
       </w:r>
     </w:p>
-    <w:bookmarkEnd w:id="50"/>
-    <w:bookmarkStart w:id="51" w:name="professional-memberships"/>
+    <w:bookmarkEnd w:id="63"/>
+    <w:bookmarkStart w:id="64" w:name="professional-memberships"/>
     <w:p>
       <w:pPr>
         <w:pStyle w:val="Heading2"/>
@@ -3847,8 +4259,8 @@
         <w:t xml:space="preserve">Pennsylvania Medical Society</w:t>
       </w:r>
     </w:p>
-    <w:bookmarkEnd w:id="51"/>
-    <w:bookmarkStart w:id="52" w:name="cultural-competencies"/>
+    <w:bookmarkEnd w:id="64"/>
+    <w:bookmarkStart w:id="65" w:name="cultural-competencies"/>
     <w:p>
       <w:pPr>
         <w:pStyle w:val="Heading2"/>
@@ -3865,8 +4277,8 @@
         <w:t xml:space="preserve">Trained in: Transgender Health, Safe Zone (LGBTQ+), Cross-Cultural Communication, Microaggression Awareness, Community Action Poverty Simulation, Psychiatric Disability Empathy, People with Disabilities as Teachers (PDAT) — Geisinger Commonwealth School of Medicine, 2017</w:t>
       </w:r>
     </w:p>
-    <w:bookmarkEnd w:id="52"/>
-    <w:bookmarkStart w:id="53" w:name="personal-interests"/>
+    <w:bookmarkEnd w:id="65"/>
+    <w:bookmarkStart w:id="66" w:name="personal-interests"/>
     <w:p>
       <w:pPr>
         <w:pStyle w:val="Heading2"/>
@@ -3887,8 +4299,8 @@
         <w:t xml:space="preserve">Photography, Programming (R, Python), Fantasy Sports, Fitness (hiking, cycling, running)</w:t>
       </w:r>
     </w:p>
-    <w:bookmarkEnd w:id="53"/>
-    <w:bookmarkEnd w:id="54"/>
+    <w:bookmarkEnd w:id="66"/>
+    <w:bookmarkEnd w:id="67"/>
     <w:sectPr>
       <w:footnotePr>
         <w:numRestart w:val="eachSect"/>
@@ -4263,15 +4675,6 @@
     </w:lvlOverride>
   </w:num>
   <w:num w:numId="1016">
-    <w:abstractNumId w:val="991"/>
-  </w:num>
-  <w:num w:numId="1017">
-    <w:abstractNumId w:val="991"/>
-  </w:num>
-  <w:num w:numId="1018">
-    <w:abstractNumId w:val="991"/>
-  </w:num>
-  <w:num w:numId="1019">
     <w:abstractNumId w:val="99411"/>
     <w:lvlOverride w:ilvl="0">
       <w:startOverride w:val="1"/>
@@ -4300,6 +4703,15 @@
     <w:lvlOverride w:ilvl="8">
       <w:startOverride w:val="1"/>
     </w:lvlOverride>
+  </w:num>
+  <w:num w:numId="1017">
+    <w:abstractNumId w:val="991"/>
+  </w:num>
+  <w:num w:numId="1018">
+    <w:abstractNumId w:val="991"/>
+  </w:num>
+  <w:num w:numId="1019">
+    <w:abstractNumId w:val="991"/>
   </w:num>
   <w:num w:numId="1020">
     <w:abstractNumId w:val="99411"/>

</xml_diff>